<commit_message>
Normalize credit comparisons and optimize bulk accounting creation
</commit_message>
<xml_diff>
--- a/docs/Manual_Operativo_Conciliacion_Credinomina.docx
+++ b/docs/Manual_Operativo_Conciliacion_Credinomina.docx
@@ -2111,7 +2111,7 @@
           <w:color w:val="000000"/>
           <w:sz w:val="22"/>
         </w:rPr>
-        <w:t xml:space="preserve"> en el menú del documento si necesita un nombre personalizado. Se conservan los vínculos y las siguientes importaciones respetan ese nombre. Renombrar no cambia la fecha del corte ni permite duplicar el corte importado de un mismo mes.</w:t>
+        <w:t xml:space="preserve"> en el menú del documento si necesita un nombre personalizado. Se conservan los vínculos y las siguientes importaciones respetan ese nombre. Renombrar no cambia la fecha del corte. Puede cargar varios cortes del mismo mes y año con nombres distintos, siempre que solo uno esté activo. Desactive el anterior antes de cargar su reemplazo; el sistema agrega un sufijo al nombre mensual si ya existe.</w:t>
       </w:r>
     </w:p>
     <w:p>
@@ -2140,7 +2140,7 @@
           <w:color w:val="000000"/>
           <w:sz w:val="22"/>
         </w:rPr>
-        <w:t xml:space="preserve"> para retirar un corte de las nuevas selecciones y búsquedas automáticas. En un documento existente, la casilla guarda su cambio automáticamente; espere el aviso. Los cambios pendientes de otros campos siguen sin guardar y debe guardarlos por separado. La casilla puede actualizarse incluso en un documento confirmado; conserva filas y referencias históricas. Desmarcarla vuelve a habilitar el corte. Desactivar no recalcula los depósitos que ya usaron esa evidencia.</w:t>
+        <w:t xml:space="preserve"> para retirar un corte de las nuevas selecciones y búsquedas automáticas. En un documento existente, la casilla guarda su cambio automáticamente; espere el aviso. Los cambios pendientes de otros campos siguen sin guardar y debe guardarlos por separado. La casilla puede actualizarse incluso en un documento confirmado; conserva filas y referencias históricas. Desmarcarla vuelve a habilitar el corte si no existe otro activo del mismo mes y año. Desactivar no recalcula los depósitos que ya usaron esa evidencia.</w:t>
       </w:r>
     </w:p>
     <w:p>
@@ -5996,7 +5996,7 @@
           <w:color w:val="000000"/>
           <w:sz w:val="22"/>
         </w:rPr>
-        <w:t>Al cargar el archivo de detalle devuelto por la empresa, los créditos numéricos con menos de seis dígitos, sin contar el sufijo -1, reciben exactamente dos ceros a la izquierda. Ejemplos: 1807 → 001807-1, 11 → 0011-1, 1122 → 001122-1 y 12230 → 0012230-1. No es un relleno hasta seis posiciones. Los números de seis o más dígitos, otros ciclos y códigos alfanuméricos conservan su normalización anterior. Esta regla no modifica los créditos del detalle generado desde aplicaciones pendientes.</w:t>
+        <w:t>Al cargar el archivo de detalle devuelto por la empresa ya no se agregan ceros iniciales. Se conservan los dígitos recibidos y solo se incorpora el sufijo -1 cuando corresponde. La comparación interna ignora los ceros iniciales de los créditos en cartera, movimientos contables, cobranza y depósitos: 1807-1 y 001807-1 coinciden, pero 1807-2 es distinto. Los registros anteriores con ceros siguen siendo compatibles sin cambiar sus números guardados. Si hay varias filas de cartera equivalentes, deben revisarse como duplicadas antes de continuar.</w:t>
       </w:r>
     </w:p>
     <w:p>

</xml_diff>